<commit_message>
Atualiza relatorio ABNT e simulacoes para respostas no cliente
</commit_message>
<xml_diff>
--- a/docs/Relatorio_M1.docx
+++ b/docs/Relatorio_M1.docx
@@ -179,7 +179,7 @@
         <w:jc w:val="both"/>
       </w:pPr>
       <w:r>
-        <w:t>Este trabalho apresenta um sistema em C++ que simula o processamento de requisições a um banco de dados no Windows. A solução utiliza processos cliente e servidor separados, comunicação por named pipe, um pool de threads e mutexes para proteger as estruturas compartilhadas. Foram implementadas as operações INSERT, SELECT, UPDATE e DELETE sobre um vetor de registros. A validação funcional verificou essas operações, o tratamento de entradas inválidas e a disputa por um mesmo identificador. A avaliação de desempenho comparou pools de uma, duas, quatro e oito threads, com quatro clientes e lotes de 100, 1.000 e 5.000 inserções, em cinco repetições por cenário. As 60 medições finais totalizaram 122.000 inserções verificadas sem perdas, duplicações ou respostas inesperadas. Para 5.000 inserções, as medianas foram 0,2620 s com uma thread e 0,3037 s com quatro. Os resultados demonstram funcionamento correto nos cenários testados, mas não evidenciam ganho consistente com o aumento do pool. A serialização do banco, a comunicação e a escrita dos logs são fatores compatíveis com esse comportamento.</w:t>
+        <w:t>Este trabalho apresenta um sistema em C++ que simula o processamento de requisições a um banco de dados no Windows. A solução utiliza processos cliente e servidor separados, comunicação por named pipe, um pool de threads e mutexes para proteger as estruturas compartilhadas. Os resultados são registrados em log e retornados ao cliente. Foram implementadas as operações INSERT, SELECT, UPDATE e DELETE sobre um vetor de registros. A validação funcional verificou essas operações, o tratamento de entradas inválidas e a disputa por um mesmo identificador. A avaliação de desempenho comparou pools de uma, duas, quatro e oito threads, com quatro clientes e lotes de 100, 1.000 e 5.000 inserções, em cinco repetições por cenário. As 60 medições finais totalizaram 122.000 inserções verificadas sem perdas, duplicações ou respostas inesperadas. Para 5.000 inserções, as medianas foram 0,3365 s com uma thread e 0,2731 s com quatro. Os resultados demonstram funcionamento correto nos cenários testados, com redução de 18,9% nesse lote, mas sem ganho consistente em todos os cenários. A serialização do banco, a comunicação e a escrita dos logs são fatores compatíveis com esse comportamento.</w:t>
       </w:r>
     </w:p>
     <w:p>
@@ -216,7 +216,7 @@
         <w:jc w:val="both"/>
       </w:pPr>
       <w:r>
-        <w:t>This report presents a C++ system that simulates database request processing on Windows. The solution uses separate client and server processes, named-pipe communication, a thread pool, and mutexes to protect shared data structures. INSERT, SELECT, UPDATE, and DELETE operations were implemented over a vector of records. Functional tests checked these operations, invalid inputs, and concurrent attempts to insert the same identifier. Performance experiments compared pools of one, two, four, and eight threads, with four clients and batches of 100, 1,000, and 5,000 insertions, using five repetitions per scenario. The 60 final measurements covered 122,000 insertions with no missing records, duplicates, or unexpected responses in the verified logs. For 5,000 insertions, median batch times were 0.2620 seconds with one thread and 0.3037 seconds with four. The tested scenarios behaved correctly, but increasing the pool did not yield a consistent performance improvement. Serialized database access, communication, and logging are factors consistent with this result. The measurements describe the complete batch, including synchronization and shutdown, rather than the latency of an individual request.</w:t>
+        <w:t>This report presents a C++ system that simulates database request processing on Windows. The solution uses separate client and server processes, named-pipe communication, a thread pool, and mutexes to protect shared data structures. Results are logged and returned to the client. INSERT, SELECT, UPDATE, and DELETE operations were implemented over a vector of records. Functional tests checked these operations, invalid inputs, and concurrent attempts to insert the same identifier. Performance experiments compared pools of one, two, four, and eight threads, with four clients and batches of 100, 1,000, and 5,000 insertions, using five repetitions per scenario. The 60 final measurements covered 122,000 insertions with no missing records, duplicates, or unexpected responses in the verified logs. For 5,000 insertions, median batch times were 0.3365 seconds with one thread and 0.2731 seconds with four. The tested scenarios behaved correctly, but increasing the pool did not yield a consistent performance improvement. Serialized database access, communication, and logging are factors consistent with this result. The measurements describe the complete batch, including synchronization and shutdown, rather than the latency of an individual request.</w:t>
       </w:r>
     </w:p>
     <w:p>
@@ -280,7 +280,7 @@
         </w:rPr>
         <w:fldChar w:fldCharType="separate"/>
       </w:r>
-      <w:hyperlink w:anchor="_Toc240748070" w:history="1">
+      <w:hyperlink w:anchor="_Toc240797371" w:history="1">
         <w:r>
           <w:rPr>
             <w:rStyle w:val="Hyperlink"/>
@@ -312,7 +312,7 @@
             <w:noProof/>
             <w:webHidden/>
           </w:rPr>
-          <w:instrText xml:space="preserve"> PAGEREF _Toc240748070 \h </w:instrText>
+          <w:instrText xml:space="preserve"> PAGEREF _Toc240797371 \h </w:instrText>
         </w:r>
         <w:r>
           <w:rPr>
@@ -363,7 +363,7 @@
           <w14:ligatures w14:val="standardContextual"/>
         </w:rPr>
       </w:pPr>
-      <w:hyperlink w:anchor="_Toc240748071" w:history="1">
+      <w:hyperlink w:anchor="_Toc240797372" w:history="1">
         <w:r>
           <w:rPr>
             <w:rStyle w:val="Hyperlink"/>
@@ -395,7 +395,7 @@
             <w:noProof/>
             <w:webHidden/>
           </w:rPr>
-          <w:instrText xml:space="preserve"> PAGEREF _Toc240748071 \h </w:instrText>
+          <w:instrText xml:space="preserve"> PAGEREF _Toc240797372 \h </w:instrText>
         </w:r>
         <w:r>
           <w:rPr>
@@ -446,7 +446,7 @@
           <w14:ligatures w14:val="standardContextual"/>
         </w:rPr>
       </w:pPr>
-      <w:hyperlink w:anchor="_Toc240748072" w:history="1">
+      <w:hyperlink w:anchor="_Toc240797373" w:history="1">
         <w:r>
           <w:rPr>
             <w:rStyle w:val="Hyperlink"/>
@@ -478,7 +478,7 @@
             <w:noProof/>
             <w:webHidden/>
           </w:rPr>
-          <w:instrText xml:space="preserve"> PAGEREF _Toc240748072 \h </w:instrText>
+          <w:instrText xml:space="preserve"> PAGEREF _Toc240797373 \h </w:instrText>
         </w:r>
         <w:r>
           <w:rPr>
@@ -529,7 +529,7 @@
           <w14:ligatures w14:val="standardContextual"/>
         </w:rPr>
       </w:pPr>
-      <w:hyperlink w:anchor="_Toc240748073" w:history="1">
+      <w:hyperlink w:anchor="_Toc240797374" w:history="1">
         <w:r>
           <w:rPr>
             <w:rStyle w:val="Hyperlink"/>
@@ -561,7 +561,7 @@
             <w:noProof/>
             <w:webHidden/>
           </w:rPr>
-          <w:instrText xml:space="preserve"> PAGEREF _Toc240748073 \h </w:instrText>
+          <w:instrText xml:space="preserve"> PAGEREF _Toc240797374 \h </w:instrText>
         </w:r>
         <w:r>
           <w:rPr>
@@ -612,7 +612,7 @@
           <w14:ligatures w14:val="standardContextual"/>
         </w:rPr>
       </w:pPr>
-      <w:hyperlink w:anchor="_Toc240748074" w:history="1">
+      <w:hyperlink w:anchor="_Toc240797375" w:history="1">
         <w:r>
           <w:rPr>
             <w:rStyle w:val="Hyperlink"/>
@@ -644,7 +644,7 @@
             <w:noProof/>
             <w:webHidden/>
           </w:rPr>
-          <w:instrText xml:space="preserve"> PAGEREF _Toc240748074 \h </w:instrText>
+          <w:instrText xml:space="preserve"> PAGEREF _Toc240797375 \h </w:instrText>
         </w:r>
         <w:r>
           <w:rPr>
@@ -695,7 +695,7 @@
           <w14:ligatures w14:val="standardContextual"/>
         </w:rPr>
       </w:pPr>
-      <w:hyperlink w:anchor="_Toc240748075" w:history="1">
+      <w:hyperlink w:anchor="_Toc240797376" w:history="1">
         <w:r>
           <w:rPr>
             <w:rStyle w:val="Hyperlink"/>
@@ -727,7 +727,7 @@
             <w:noProof/>
             <w:webHidden/>
           </w:rPr>
-          <w:instrText xml:space="preserve"> PAGEREF _Toc240748075 \h </w:instrText>
+          <w:instrText xml:space="preserve"> PAGEREF _Toc240797376 \h </w:instrText>
         </w:r>
         <w:r>
           <w:rPr>
@@ -778,7 +778,7 @@
           <w14:ligatures w14:val="standardContextual"/>
         </w:rPr>
       </w:pPr>
-      <w:hyperlink w:anchor="_Toc240748076" w:history="1">
+      <w:hyperlink w:anchor="_Toc240797377" w:history="1">
         <w:r>
           <w:rPr>
             <w:rStyle w:val="Hyperlink"/>
@@ -810,7 +810,7 @@
             <w:noProof/>
             <w:webHidden/>
           </w:rPr>
-          <w:instrText xml:space="preserve"> PAGEREF _Toc240748076 \h </w:instrText>
+          <w:instrText xml:space="preserve"> PAGEREF _Toc240797377 \h </w:instrText>
         </w:r>
         <w:r>
           <w:rPr>
@@ -861,7 +861,7 @@
           <w14:ligatures w14:val="standardContextual"/>
         </w:rPr>
       </w:pPr>
-      <w:hyperlink w:anchor="_Toc240748077" w:history="1">
+      <w:hyperlink w:anchor="_Toc240797378" w:history="1">
         <w:r>
           <w:rPr>
             <w:rStyle w:val="Hyperlink"/>
@@ -893,7 +893,7 @@
             <w:noProof/>
             <w:webHidden/>
           </w:rPr>
-          <w:instrText xml:space="preserve"> PAGEREF _Toc240748077 \h </w:instrText>
+          <w:instrText xml:space="preserve"> PAGEREF _Toc240797378 \h </w:instrText>
         </w:r>
         <w:r>
           <w:rPr>
@@ -944,7 +944,7 @@
           <w14:ligatures w14:val="standardContextual"/>
         </w:rPr>
       </w:pPr>
-      <w:hyperlink w:anchor="_Toc240748078" w:history="1">
+      <w:hyperlink w:anchor="_Toc240797379" w:history="1">
         <w:r>
           <w:rPr>
             <w:rStyle w:val="Hyperlink"/>
@@ -976,7 +976,7 @@
             <w:noProof/>
             <w:webHidden/>
           </w:rPr>
-          <w:instrText xml:space="preserve"> PAGEREF _Toc240748078 \h </w:instrText>
+          <w:instrText xml:space="preserve"> PAGEREF _Toc240797379 \h </w:instrText>
         </w:r>
         <w:r>
           <w:rPr>
@@ -1027,7 +1027,7 @@
           <w14:ligatures w14:val="standardContextual"/>
         </w:rPr>
       </w:pPr>
-      <w:hyperlink w:anchor="_Toc240748079" w:history="1">
+      <w:hyperlink w:anchor="_Toc240797380" w:history="1">
         <w:r>
           <w:rPr>
             <w:rStyle w:val="Hyperlink"/>
@@ -1059,7 +1059,7 @@
             <w:noProof/>
             <w:webHidden/>
           </w:rPr>
-          <w:instrText xml:space="preserve"> PAGEREF _Toc240748079 \h </w:instrText>
+          <w:instrText xml:space="preserve"> PAGEREF _Toc240797380 \h </w:instrText>
         </w:r>
         <w:r>
           <w:rPr>
@@ -1110,7 +1110,7 @@
           <w14:ligatures w14:val="standardContextual"/>
         </w:rPr>
       </w:pPr>
-      <w:hyperlink w:anchor="_Toc240748080" w:history="1">
+      <w:hyperlink w:anchor="_Toc240797381" w:history="1">
         <w:r>
           <w:rPr>
             <w:rStyle w:val="Hyperlink"/>
@@ -1142,7 +1142,7 @@
             <w:noProof/>
             <w:webHidden/>
           </w:rPr>
-          <w:instrText xml:space="preserve"> PAGEREF _Toc240748080 \h </w:instrText>
+          <w:instrText xml:space="preserve"> PAGEREF _Toc240797381 \h </w:instrText>
         </w:r>
         <w:r>
           <w:rPr>
@@ -1193,7 +1193,7 @@
           <w14:ligatures w14:val="standardContextual"/>
         </w:rPr>
       </w:pPr>
-      <w:hyperlink w:anchor="_Toc240748081" w:history="1">
+      <w:hyperlink w:anchor="_Toc240797382" w:history="1">
         <w:r>
           <w:rPr>
             <w:rStyle w:val="Hyperlink"/>
@@ -1225,7 +1225,7 @@
             <w:noProof/>
             <w:webHidden/>
           </w:rPr>
-          <w:instrText xml:space="preserve"> PAGEREF _Toc240748081 \h </w:instrText>
+          <w:instrText xml:space="preserve"> PAGEREF _Toc240797382 \h </w:instrText>
         </w:r>
         <w:r>
           <w:rPr>
@@ -1276,7 +1276,7 @@
           <w14:ligatures w14:val="standardContextual"/>
         </w:rPr>
       </w:pPr>
-      <w:hyperlink w:anchor="_Toc240748082" w:history="1">
+      <w:hyperlink w:anchor="_Toc240797383" w:history="1">
         <w:r>
           <w:rPr>
             <w:rStyle w:val="Hyperlink"/>
@@ -1308,7 +1308,7 @@
             <w:noProof/>
             <w:webHidden/>
           </w:rPr>
-          <w:instrText xml:space="preserve"> PAGEREF _Toc240748082 \h </w:instrText>
+          <w:instrText xml:space="preserve"> PAGEREF _Toc240797383 \h </w:instrText>
         </w:r>
         <w:r>
           <w:rPr>
@@ -1372,7 +1372,7 @@
       <w:pPr>
         <w:pStyle w:val="Ttulo1"/>
       </w:pPr>
-      <w:bookmarkStart w:id="0" w:name="_Toc240748070"/>
+      <w:bookmarkStart w:id="0" w:name="_Toc240797371"/>
       <w:r>
         <w:lastRenderedPageBreak/>
         <w:t>1 INTRODUÇÃO</w:t>
@@ -1399,7 +1399,7 @@
       <w:pPr>
         <w:pStyle w:val="Ttulo2"/>
       </w:pPr>
-      <w:bookmarkStart w:id="1" w:name="_Toc240748071"/>
+      <w:bookmarkStart w:id="1" w:name="_Toc240797372"/>
       <w:r>
         <w:t>1.1 Enunciado e requisitos</w:t>
       </w:r>
@@ -1418,7 +1418,7 @@
         <w:jc w:val="both"/>
       </w:pPr>
       <w:r>
-        <w:t>A implementação utiliza dois executáveis, cliente.exe e servidor.exe. O banco é um vetor em memória, contendo ID e nome. As respostas das operações são gravadas em servidor.log e exibidas no terminal do servidor. O projeto não implementa um interpretador SQL completo; os comandos seguem uma sintaxe textual reduzida.</w:t>
+        <w:t>A implementação utiliza cliente.exe e servidor.exe. O banco é um vetor em memória, com ID e nome. As respostas são gravadas em servidor.log, exibidas no servidor e devolvidas ao cliente pelo named pipe. O log atende à alternativa prevista no enunciado; o retorno ao cliente facilita o uso. A sintaxe dos comandos é textual e reduzida.</w:t>
       </w:r>
     </w:p>
     <w:p>
@@ -1837,7 +1837,7 @@
               <w:rPr>
                 <w:sz w:val="20"/>
               </w:rPr>
-              <w:t>INSERT, SELECT, UPDATE e DELETE; resultado em log.</w:t>
+              <w:t>INSERT, SELECT, UPDATE e DELETE; resultados no log e no cliente via IPC.</w:t>
             </w:r>
           </w:p>
         </w:tc>
@@ -1864,7 +1864,7 @@
       <w:pPr>
         <w:pStyle w:val="Ttulo2"/>
       </w:pPr>
-      <w:bookmarkStart w:id="2" w:name="_Toc240748072"/>
+      <w:bookmarkStart w:id="2" w:name="_Toc240797373"/>
       <w:r>
         <w:lastRenderedPageBreak/>
         <w:t>1.2 Processos threads e sincronização</w:t>
@@ -1900,7 +1900,7 @@
         <w:pStyle w:val="Ttulo1"/>
         <w:pageBreakBefore/>
       </w:pPr>
-      <w:bookmarkStart w:id="3" w:name="_Toc240748073"/>
+      <w:bookmarkStart w:id="3" w:name="_Toc240797374"/>
       <w:r>
         <w:lastRenderedPageBreak/>
         <w:t>2 ARQUITETURA E IMPLEMENTAÇÃO</w:t>
@@ -1912,7 +1912,7 @@
         <w:jc w:val="both"/>
       </w:pPr>
       <w:r>
-        <w:t>A thread principal recebe cada comando pelo named pipe e o coloca na fila protegida. O semáforo sinaliza trabalho disponível. Uma thread do pool retira o pedido, libera a fila e executa a operação no banco. Outro mutex protege a gravação da resposta. A Figura 1 apresenta esse fluxo.</w:t>
+        <w:t>A thread principal recebe o comando e enfileira um Pedido com texto e handle do pipe. Outra instância recebe novos clientes. O semáforo acorda uma thread do pool, que retira o pedido, executa a operação sob o mutex do banco e registra o resultado sob o mutex do log. Fora desses mutexes, devolve a resposta ao cliente e fecha a conexão (Figura 1).</w:t>
       </w:r>
     </w:p>
     <w:p>
@@ -1988,7 +1988,7 @@
         <w:jc w:val="both"/>
       </w:pPr>
       <w:r>
-        <w:t>A confirmação indica somente recebimento; o resultado fica no log. Como as threads podem concluir pedidos em outra ordem, uma operação dependente deve ser enviada após o resultado da anterior. O mutex não garante ordem de conclusão.</w:t>
+        <w:t>O cliente espera o resultado completo antes de enviar outro comando. Pedidos do mesmo cliente terminam em sequência; entre clientes distintos, o pool não garante a ordem de conclusão. O retorno não substitui o log.</w:t>
       </w:r>
     </w:p>
     <w:p>
@@ -1996,7 +1996,7 @@
         <w:jc w:val="both"/>
       </w:pPr>
       <w:r>
-        <w:t>Os IDs são inteiros não negativos. Os nomes podem conter espaços e têm limite de 49 bytes. O comando PARAR interrompe a recepção e permite concluir os pedidos já recebidos antes de fechar o servidor. O banco é volátil: seus registros não persistem após o encerramento.</w:t>
+        <w:t>IDs são inteiros não negativos; nomes admitem espaços e até 49 bytes. PARAR conclui os pedidos recebidos antes de encerrar. O banco é volátil. CLS limpa a tela do cliente, mantendo as instruções fixas no topo em terminais compatíveis.</w:t>
       </w:r>
     </w:p>
     <w:p>
@@ -2004,7 +2004,7 @@
         <w:pStyle w:val="Ttulo2"/>
         <w:pageBreakBefore/>
       </w:pPr>
-      <w:bookmarkStart w:id="4" w:name="_Toc240748074"/>
+      <w:bookmarkStart w:id="4" w:name="_Toc240797375"/>
       <w:r>
         <w:lastRenderedPageBreak/>
         <w:t>2.1 Trechos principais da implementação</w:t>
@@ -2172,7 +2172,7 @@
           <w:rFonts w:ascii="Consolas" w:hAnsi="Consolas"/>
           <w:sz w:val="20"/>
         </w:rPr>
-        <w:t>std::string pedido;</w:t>
+        <w:t>Pedido pedido;</w:t>
       </w:r>
     </w:p>
     <w:p>
@@ -2283,7 +2283,7 @@
           <w:rFonts w:ascii="Consolas" w:hAnsi="Consolas"/>
           <w:sz w:val="20"/>
         </w:rPr>
-        <w:t>std::string resposta = executar_requisicao(pedido);</w:t>
+        <w:t>std::string resposta = executar_requisicao(pedido.texto);</w:t>
       </w:r>
     </w:p>
     <w:p>
@@ -2373,7 +2373,7 @@
         <w:jc w:val="both"/>
       </w:pPr>
       <w:r>
-        <w:t>Com PARAR, o servidor sinaliza o encerramento e acorda as threads. O pool conclui a fila; WaitForMultipleObjects aguarda todas as threads antes do fechamento dos handles.</w:t>
+        <w:t>Depois do log, responder_e_fechar(pedido.pipe, resposta) devolve o resultado. Com PARAR, WaitForMultipleObjects aguarda o pool concluir os pedidos; só então o servidor responde ao pedido de encerramento.</w:t>
       </w:r>
     </w:p>
     <w:p>
@@ -2381,7 +2381,7 @@
         <w:pStyle w:val="Ttulo1"/>
         <w:pageBreakBefore/>
       </w:pPr>
-      <w:bookmarkStart w:id="5" w:name="_Toc240748075"/>
+      <w:bookmarkStart w:id="5" w:name="_Toc240797376"/>
       <w:r>
         <w:lastRenderedPageBreak/>
         <w:t>3 METODOLOGIA EXPERIMENTAL</w:t>
@@ -2394,7 +2394,7 @@
         <w:keepNext/>
       </w:pPr>
       <w:r>
-        <w:t>Quadro 2 – Ambiente das simulações de 19 de setembro de 2026</w:t>
+        <w:t>Quadro 2 – Ambiente das simulações de 20 de setembro de 2026</w:t>
       </w:r>
     </w:p>
     <w:tbl>
@@ -2880,7 +2880,7 @@
         <w:rPr>
           <w:sz w:val="20"/>
         </w:rPr>
-        <w:t>Fonte: configuração registrada em hardware.json e dados.json da rodada final (2026).</w:t>
+        <w:t>Fonte: hardware.json (mesma máquina caracterizada em 19/09) e dados.json da nova rodada (2026).</w:t>
       </w:r>
     </w:p>
     <w:p>
@@ -2896,7 +2896,7 @@
         <w:jc w:val="both"/>
       </w:pPr>
       <w:r>
-        <w:t>Antes das medições, foi realizado um aquecimento de 1.000 inserções para cada tamanho de pool. A ordem dos 60 ensaios foi embaralhada com semente 20260919. Nenhuma repetição da rodada final foi excluída. Uma rodada preliminar coincidiu com a instalação da biblioteca de gráficos e foi preservada apenas como registro, sem participar das estatísticas.</w:t>
+        <w:t>Houve um aquecimento de 1.000 inserções para cada pool. Os 60 ensaios foram embaralhados com semente 20260919; nenhum foi excluído. Usou-se uma cópia com apenas o nome do pipe alterado, evitando conflito com o servidor manual aberto. METODO.md e fontes_medidos registram essa condição. As rodadas anteriores não compõem estas estatísticas.</w:t>
       </w:r>
     </w:p>
     <w:p>
@@ -2904,7 +2904,7 @@
         <w:jc w:val="both"/>
       </w:pPr>
       <w:r>
-        <w:t>O tempo foi medido por time.perf_counter(), desde o despacho dos envios até a saída do servidor após PARAR. A medida inclui IPC, operações, sincronização, logs, coordenação Python e encerramento. As chamadas de criação dos processos ocorreram antes do cronômetro, embora parte da inicialização dos clientes possa ter ocorrido depois. A validação do log foi realizada fora do intervalo medido.</w:t>
+        <w:t>O tempo foi medido por time.perf_counter(), do despacho dos envios à saída do servidor após PARAR. Inclui IPC de ida e volta, operações, sincronização, logs, coordenação Python e encerramento. Os processos foram lançados antes do cronômetro; parte da inicialização pode estar incluída. A validação do log ocorreu após a medição.</w:t>
       </w:r>
     </w:p>
     <w:p>
@@ -2912,7 +2912,7 @@
         <w:jc w:val="both"/>
       </w:pPr>
       <w:r>
-        <w:t>O log permaneceu ativo, com flush por resposta. A saída do servidor foi redirecionada a um arquivo e a saída normal dos clientes foi descartada. Portanto, o tempo apresentado é do lote completo nessas condições; não é latência individual nem tempo exclusivo do banco. As estatísticas usadas são mediana, média, desvio padrão amostral e faixa observada. A vazão é N dividido pela mediana, e a aceleração é a razão entre a mediana com uma thread e a mediana do cenário.</w:t>
+        <w:t>Cada cliente aguardou o resultado antes de enviar o próximo pedido. O log ficou ativo, com flush. A saída do servidor foi redirecionada e a dos clientes, descartada; o cabeçalho interativo ficou desativado. Medem-se lotes completos, não latências individuais. Usaram-se mediana, média, desvio padrão amostral e faixa observada. Vazão = N/mediana; aceleração = mediana de uma thread/mediana do cenário.</w:t>
       </w:r>
     </w:p>
     <w:p>
@@ -2920,7 +2920,7 @@
         <w:pStyle w:val="Ttulo1"/>
         <w:pageBreakBefore/>
       </w:pPr>
-      <w:bookmarkStart w:id="6" w:name="_Toc240748076"/>
+      <w:bookmarkStart w:id="6" w:name="_Toc240797377"/>
       <w:r>
         <w:lastRenderedPageBreak/>
         <w:t>4 RESULTADOS E DISCUSSÃO</w:t>
@@ -3294,7 +3294,7 @@
               <w:rPr>
                 <w:sz w:val="19"/>
               </w:rPr>
-              <w:t>0,0204</w:t>
+              <w:t>0,0192</w:t>
             </w:r>
           </w:p>
         </w:tc>
@@ -3319,14 +3319,14 @@
               <w:rPr>
                 <w:sz w:val="19"/>
               </w:rPr>
-              <w:t>0,0223 ±</w:t>
+              <w:t>0,0285 ±</w:t>
             </w:r>
             <w:r>
               <w:rPr>
                 <w:sz w:val="19"/>
               </w:rPr>
               <w:br/>
-              <w:t>0,0085</w:t>
+              <w:t>0,0202</w:t>
             </w:r>
           </w:p>
         </w:tc>
@@ -3351,14 +3351,14 @@
               <w:rPr>
                 <w:sz w:val="19"/>
               </w:rPr>
-              <w:t>0,0149 a</w:t>
+              <w:t>0,0146 a</w:t>
             </w:r>
             <w:r>
               <w:rPr>
                 <w:sz w:val="19"/>
               </w:rPr>
               <w:br/>
-              <w:t>0,0365</w:t>
+              <w:t>0,0625</w:t>
             </w:r>
           </w:p>
         </w:tc>
@@ -3383,7 +3383,7 @@
               <w:rPr>
                 <w:sz w:val="19"/>
               </w:rPr>
-              <w:t>4.912</w:t>
+              <w:t>5.216</w:t>
             </w:r>
           </w:p>
         </w:tc>
@@ -3489,7 +3489,7 @@
               <w:rPr>
                 <w:sz w:val="19"/>
               </w:rPr>
-              <w:t>0,0207</w:t>
+              <w:t>0,0301</w:t>
             </w:r>
           </w:p>
         </w:tc>
@@ -3514,14 +3514,14 @@
               <w:rPr>
                 <w:sz w:val="19"/>
               </w:rPr>
-              <w:t>0,0310 ±</w:t>
+              <w:t>0,0417 ±</w:t>
             </w:r>
             <w:r>
               <w:rPr>
                 <w:sz w:val="19"/>
               </w:rPr>
               <w:br/>
-              <w:t>0,0173</w:t>
+              <w:t>0,0178</w:t>
             </w:r>
           </w:p>
         </w:tc>
@@ -3546,14 +3546,14 @@
               <w:rPr>
                 <w:sz w:val="19"/>
               </w:rPr>
-              <w:t>0,0146 a</w:t>
+              <w:t>0,0276 a</w:t>
             </w:r>
             <w:r>
               <w:rPr>
                 <w:sz w:val="19"/>
               </w:rPr>
               <w:br/>
-              <w:t>0,0500</w:t>
+              <w:t>0,0635</w:t>
             </w:r>
           </w:p>
         </w:tc>
@@ -3578,7 +3578,7 @@
               <w:rPr>
                 <w:sz w:val="19"/>
               </w:rPr>
-              <w:t>4.834</w:t>
+              <w:t>3.325</w:t>
             </w:r>
           </w:p>
         </w:tc>
@@ -3603,7 +3603,7 @@
               <w:rPr>
                 <w:sz w:val="19"/>
               </w:rPr>
-              <w:t>0,98</w:t>
+              <w:t>0,64</w:t>
             </w:r>
           </w:p>
         </w:tc>
@@ -3684,7 +3684,7 @@
               <w:rPr>
                 <w:sz w:val="19"/>
               </w:rPr>
-              <w:t>0,0221</w:t>
+              <w:t>0,0207</w:t>
             </w:r>
           </w:p>
         </w:tc>
@@ -3709,14 +3709,14 @@
               <w:rPr>
                 <w:sz w:val="19"/>
               </w:rPr>
-              <w:t>0,0321 ±</w:t>
+              <w:t>0,0221 ±</w:t>
             </w:r>
             <w:r>
               <w:rPr>
                 <w:sz w:val="19"/>
               </w:rPr>
               <w:br/>
-              <w:t>0,0178</w:t>
+              <w:t>0,0064</w:t>
             </w:r>
           </w:p>
         </w:tc>
@@ -3741,14 +3741,14 @@
               <w:rPr>
                 <w:sz w:val="19"/>
               </w:rPr>
-              <w:t>0,0141 a</w:t>
+              <w:t>0,0154 a</w:t>
             </w:r>
             <w:r>
               <w:rPr>
                 <w:sz w:val="19"/>
               </w:rPr>
               <w:br/>
-              <w:t>0,0528</w:t>
+              <w:t>0,0294</w:t>
             </w:r>
           </w:p>
         </w:tc>
@@ -3773,7 +3773,7 @@
               <w:rPr>
                 <w:sz w:val="19"/>
               </w:rPr>
-              <w:t>4.526</w:t>
+              <w:t>4.821</w:t>
             </w:r>
           </w:p>
         </w:tc>
@@ -3879,7 +3879,7 @@
               <w:rPr>
                 <w:sz w:val="19"/>
               </w:rPr>
-              <w:t>0,0207</w:t>
+              <w:t>0,0201</w:t>
             </w:r>
           </w:p>
         </w:tc>
@@ -3904,14 +3904,14 @@
               <w:rPr>
                 <w:sz w:val="19"/>
               </w:rPr>
-              <w:t>0,0306 ±</w:t>
+              <w:t>0,0295 ±</w:t>
             </w:r>
             <w:r>
               <w:rPr>
                 <w:sz w:val="19"/>
               </w:rPr>
               <w:br/>
-              <w:t>0,0152</w:t>
+              <w:t>0,0202</w:t>
             </w:r>
           </w:p>
         </w:tc>
@@ -3936,14 +3936,14 @@
               <w:rPr>
                 <w:sz w:val="19"/>
               </w:rPr>
-              <w:t>0,0184 a</w:t>
+              <w:t>0,0167 a</w:t>
             </w:r>
             <w:r>
               <w:rPr>
                 <w:sz w:val="19"/>
               </w:rPr>
               <w:br/>
-              <w:t>0,0487</w:t>
+              <w:t>0,0650</w:t>
             </w:r>
           </w:p>
         </w:tc>
@@ -3968,7 +3968,7 @@
               <w:rPr>
                 <w:sz w:val="19"/>
               </w:rPr>
-              <w:t>4.820</w:t>
+              <w:t>4.963</w:t>
             </w:r>
           </w:p>
         </w:tc>
@@ -3993,7 +3993,7 @@
               <w:rPr>
                 <w:sz w:val="19"/>
               </w:rPr>
-              <w:t>0,98</w:t>
+              <w:t>0,95</w:t>
             </w:r>
           </w:p>
         </w:tc>
@@ -4074,7 +4074,7 @@
               <w:rPr>
                 <w:sz w:val="19"/>
               </w:rPr>
-              <w:t>0,0575</w:t>
+              <w:t>0,0632</w:t>
             </w:r>
           </w:p>
         </w:tc>
@@ -4099,14 +4099,14 @@
               <w:rPr>
                 <w:sz w:val="19"/>
               </w:rPr>
-              <w:t>0,0671 ±</w:t>
+              <w:t>0,0691 ±</w:t>
             </w:r>
             <w:r>
               <w:rPr>
                 <w:sz w:val="19"/>
               </w:rPr>
               <w:br/>
-              <w:t>0,0228</w:t>
+              <w:t>0,0236</w:t>
             </w:r>
           </w:p>
         </w:tc>
@@ -4131,14 +4131,14 @@
               <w:rPr>
                 <w:sz w:val="19"/>
               </w:rPr>
-              <w:t>0,0498 a</w:t>
+              <w:t>0,0472 a</w:t>
             </w:r>
             <w:r>
               <w:rPr>
                 <w:sz w:val="19"/>
               </w:rPr>
               <w:br/>
-              <w:t>0,1046</w:t>
+              <w:t>0,1063</w:t>
             </w:r>
           </w:p>
         </w:tc>
@@ -4163,7 +4163,7 @@
               <w:rPr>
                 <w:sz w:val="19"/>
               </w:rPr>
-              <w:t>17.380</w:t>
+              <w:t>15.820</w:t>
             </w:r>
           </w:p>
         </w:tc>
@@ -4269,7 +4269,7 @@
               <w:rPr>
                 <w:sz w:val="19"/>
               </w:rPr>
-              <w:t>0,0541</w:t>
+              <w:t>0,0554</w:t>
             </w:r>
           </w:p>
         </w:tc>
@@ -4294,14 +4294,14 @@
               <w:rPr>
                 <w:sz w:val="19"/>
               </w:rPr>
-              <w:t>0,0583 ±</w:t>
+              <w:t>0,0718 ±</w:t>
             </w:r>
             <w:r>
               <w:rPr>
                 <w:sz w:val="19"/>
               </w:rPr>
               <w:br/>
-              <w:t>0,0124</w:t>
+              <w:t>0,0339</w:t>
             </w:r>
           </w:p>
         </w:tc>
@@ -4326,14 +4326,14 @@
               <w:rPr>
                 <w:sz w:val="19"/>
               </w:rPr>
-              <w:t>0,0499 a</w:t>
+              <w:t>0,0514 a</w:t>
             </w:r>
             <w:r>
               <w:rPr>
                 <w:sz w:val="19"/>
               </w:rPr>
               <w:br/>
-              <w:t>0,0801</w:t>
+              <w:t>0,1313</w:t>
             </w:r>
           </w:p>
         </w:tc>
@@ -4358,7 +4358,7 @@
               <w:rPr>
                 <w:sz w:val="19"/>
               </w:rPr>
-              <w:t>18.493</w:t>
+              <w:t>18.064</w:t>
             </w:r>
           </w:p>
         </w:tc>
@@ -4383,7 +4383,7 @@
               <w:rPr>
                 <w:sz w:val="19"/>
               </w:rPr>
-              <w:t>1,06</w:t>
+              <w:t>1,14</w:t>
             </w:r>
           </w:p>
         </w:tc>
@@ -4464,7 +4464,7 @@
               <w:rPr>
                 <w:sz w:val="19"/>
               </w:rPr>
-              <w:t>0,0720</w:t>
+              <w:t>0,0788</w:t>
             </w:r>
           </w:p>
         </w:tc>
@@ -4489,14 +4489,14 @@
               <w:rPr>
                 <w:sz w:val="19"/>
               </w:rPr>
-              <w:t>0,0772 ±</w:t>
+              <w:t>0,0965 ±</w:t>
             </w:r>
             <w:r>
               <w:rPr>
                 <w:sz w:val="19"/>
               </w:rPr>
               <w:br/>
-              <w:t>0,0253</w:t>
+              <w:t>0,0414</w:t>
             </w:r>
           </w:p>
         </w:tc>
@@ -4521,14 +4521,14 @@
               <w:rPr>
                 <w:sz w:val="19"/>
               </w:rPr>
-              <w:t>0,0534 a</w:t>
+              <w:t>0,0641 a</w:t>
             </w:r>
             <w:r>
               <w:rPr>
                 <w:sz w:val="19"/>
               </w:rPr>
               <w:br/>
-              <w:t>0,1059</w:t>
+              <w:t>0,1662</w:t>
             </w:r>
           </w:p>
         </w:tc>
@@ -4553,7 +4553,7 @@
               <w:rPr>
                 <w:sz w:val="19"/>
               </w:rPr>
-              <w:t>13.882</w:t>
+              <w:t>12.686</w:t>
             </w:r>
           </w:p>
         </w:tc>
@@ -4659,7 +4659,7 @@
               <w:rPr>
                 <w:sz w:val="19"/>
               </w:rPr>
-              <w:t>0,0671</w:t>
+              <w:t>0,1255</w:t>
             </w:r>
           </w:p>
         </w:tc>
@@ -4684,14 +4684,14 @@
               <w:rPr>
                 <w:sz w:val="19"/>
               </w:rPr>
-              <w:t>0,0735 ±</w:t>
+              <w:t>0,1174 ±</w:t>
             </w:r>
             <w:r>
               <w:rPr>
                 <w:sz w:val="19"/>
               </w:rPr>
               <w:br/>
-              <w:t>0,0196</w:t>
+              <w:t>0,0426</w:t>
             </w:r>
           </w:p>
         </w:tc>
@@ -4716,14 +4716,14 @@
               <w:rPr>
                 <w:sz w:val="19"/>
               </w:rPr>
-              <w:t>0,0543 a</w:t>
+              <w:t>0,0507 a</w:t>
             </w:r>
             <w:r>
               <w:rPr>
                 <w:sz w:val="19"/>
               </w:rPr>
               <w:br/>
-              <w:t>0,1064</w:t>
+              <w:t>0,1535</w:t>
             </w:r>
           </w:p>
         </w:tc>
@@ -4748,7 +4748,7 @@
               <w:rPr>
                 <w:sz w:val="19"/>
               </w:rPr>
-              <w:t>14.901</w:t>
+              <w:t>7.967</w:t>
             </w:r>
           </w:p>
         </w:tc>
@@ -4773,7 +4773,7 @@
               <w:rPr>
                 <w:sz w:val="19"/>
               </w:rPr>
-              <w:t>0,86</w:t>
+              <w:t>0,50</w:t>
             </w:r>
           </w:p>
         </w:tc>
@@ -4854,7 +4854,7 @@
               <w:rPr>
                 <w:sz w:val="19"/>
               </w:rPr>
-              <w:t>0,2620</w:t>
+              <w:t>0,3365</w:t>
             </w:r>
           </w:p>
         </w:tc>
@@ -4879,14 +4879,14 @@
               <w:rPr>
                 <w:sz w:val="19"/>
               </w:rPr>
-              <w:t>0,2643 ±</w:t>
+              <w:t>0,3133 ±</w:t>
             </w:r>
             <w:r>
               <w:rPr>
                 <w:sz w:val="19"/>
               </w:rPr>
               <w:br/>
-              <w:t>0,0172</w:t>
+              <w:t>0,0516</w:t>
             </w:r>
           </w:p>
         </w:tc>
@@ -4911,14 +4911,14 @@
               <w:rPr>
                 <w:sz w:val="19"/>
               </w:rPr>
-              <w:t>0,2471 a</w:t>
+              <w:t>0,2479 a</w:t>
             </w:r>
             <w:r>
               <w:rPr>
                 <w:sz w:val="19"/>
               </w:rPr>
               <w:br/>
-              <w:t>0,2904</w:t>
+              <w:t>0,3583</w:t>
             </w:r>
           </w:p>
         </w:tc>
@@ -4943,7 +4943,7 @@
               <w:rPr>
                 <w:sz w:val="19"/>
               </w:rPr>
-              <w:t>19.082</w:t>
+              <w:t>14.857</w:t>
             </w:r>
           </w:p>
         </w:tc>
@@ -5049,7 +5049,7 @@
               <w:rPr>
                 <w:sz w:val="19"/>
               </w:rPr>
-              <w:t>0,2928</w:t>
+              <w:t>0,3330</w:t>
             </w:r>
           </w:p>
         </w:tc>
@@ -5074,14 +5074,14 @@
               <w:rPr>
                 <w:sz w:val="19"/>
               </w:rPr>
-              <w:t>0,2842 ±</w:t>
+              <w:t>0,3412 ±</w:t>
             </w:r>
             <w:r>
               <w:rPr>
                 <w:sz w:val="19"/>
               </w:rPr>
               <w:br/>
-              <w:t>0,0181</w:t>
+              <w:t>0,0606</w:t>
             </w:r>
           </w:p>
         </w:tc>
@@ -5106,14 +5106,14 @@
               <w:rPr>
                 <w:sz w:val="19"/>
               </w:rPr>
-              <w:t>0,2594 a</w:t>
+              <w:t>0,2541 a</w:t>
             </w:r>
             <w:r>
               <w:rPr>
                 <w:sz w:val="19"/>
               </w:rPr>
               <w:br/>
-              <w:t>0,3037</w:t>
+              <w:t>0,4157</w:t>
             </w:r>
           </w:p>
         </w:tc>
@@ -5138,7 +5138,7 @@
               <w:rPr>
                 <w:sz w:val="19"/>
               </w:rPr>
-              <w:t>17.075</w:t>
+              <w:t>15.013</w:t>
             </w:r>
           </w:p>
         </w:tc>
@@ -5163,7 +5163,7 @@
               <w:rPr>
                 <w:sz w:val="19"/>
               </w:rPr>
-              <w:t>0,89</w:t>
+              <w:t>1,01</w:t>
             </w:r>
           </w:p>
         </w:tc>
@@ -5244,7 +5244,7 @@
               <w:rPr>
                 <w:sz w:val="19"/>
               </w:rPr>
-              <w:t>0,3037</w:t>
+              <w:t>0,2731</w:t>
             </w:r>
           </w:p>
         </w:tc>
@@ -5269,14 +5269,14 @@
               <w:rPr>
                 <w:sz w:val="19"/>
               </w:rPr>
-              <w:t>0,2918 ±</w:t>
+              <w:t>0,2805 ±</w:t>
             </w:r>
             <w:r>
               <w:rPr>
                 <w:sz w:val="19"/>
               </w:rPr>
               <w:br/>
-              <w:t>0,0229</w:t>
+              <w:t>0,0272</w:t>
             </w:r>
           </w:p>
         </w:tc>
@@ -5301,14 +5301,14 @@
               <w:rPr>
                 <w:sz w:val="19"/>
               </w:rPr>
-              <w:t>0,2659 a</w:t>
+              <w:t>0,2501 a</w:t>
             </w:r>
             <w:r>
               <w:rPr>
                 <w:sz w:val="19"/>
               </w:rPr>
               <w:br/>
-              <w:t>0,3111</w:t>
+              <w:t>0,3151</w:t>
             </w:r>
           </w:p>
         </w:tc>
@@ -5333,7 +5333,7 @@
               <w:rPr>
                 <w:sz w:val="19"/>
               </w:rPr>
-              <w:t>16.466</w:t>
+              <w:t>18.309</w:t>
             </w:r>
           </w:p>
         </w:tc>
@@ -5358,7 +5358,7 @@
               <w:rPr>
                 <w:sz w:val="19"/>
               </w:rPr>
-              <w:t>0,86</w:t>
+              <w:t>1,23</w:t>
             </w:r>
           </w:p>
         </w:tc>
@@ -5442,7 +5442,7 @@
               <w:rPr>
                 <w:sz w:val="19"/>
               </w:rPr>
-              <w:t>0,2968</w:t>
+              <w:t>0,3683</w:t>
             </w:r>
           </w:p>
         </w:tc>
@@ -5468,14 +5468,14 @@
               <w:rPr>
                 <w:sz w:val="19"/>
               </w:rPr>
-              <w:t>0,2945 ±</w:t>
+              <w:t>0,3720 ±</w:t>
             </w:r>
             <w:r>
               <w:rPr>
                 <w:sz w:val="19"/>
               </w:rPr>
               <w:br/>
-              <w:t>0,0258</w:t>
+              <w:t>0,0766</w:t>
             </w:r>
           </w:p>
         </w:tc>
@@ -5501,14 +5501,14 @@
               <w:rPr>
                 <w:sz w:val="19"/>
               </w:rPr>
-              <w:t>0,2607 a</w:t>
+              <w:t>0,2733 a</w:t>
             </w:r>
             <w:r>
               <w:rPr>
                 <w:sz w:val="19"/>
               </w:rPr>
               <w:br/>
-              <w:t>0,3323</w:t>
+              <w:t>0,4745</w:t>
             </w:r>
           </w:p>
         </w:tc>
@@ -5534,7 +5534,7 @@
               <w:rPr>
                 <w:sz w:val="19"/>
               </w:rPr>
-              <w:t>16.844</w:t>
+              <w:t>13.577</w:t>
             </w:r>
           </w:p>
         </w:tc>
@@ -5560,7 +5560,7 @@
               <w:rPr>
                 <w:sz w:val="19"/>
               </w:rPr>
-              <w:t>0,88</w:t>
+              <w:t>0,91</w:t>
             </w:r>
           </w:p>
         </w:tc>
@@ -5580,7 +5580,7 @@
         <w:rPr>
           <w:sz w:val="20"/>
         </w:rPr>
-        <w:t>Fonte: dados.json e resumo.json da rodada simulacao_20260919_213111 (2026).</w:t>
+        <w:t>Fonte: dados.json e resumo.json da rodada simulacao_20260920_114551 (2026).</w:t>
       </w:r>
     </w:p>
     <w:p>
@@ -5596,7 +5596,7 @@
         <w:jc w:val="both"/>
       </w:pPr>
       <w:r>
-        <w:t>No lote de 5.000 inserções, uma thread apresentou mediana de 0,2620 s e vazão de aproximadamente 19.082 requisições/s. Com quatro threads, a mediana foi de 0,3037 s, ou 15,9% maior, com vazão de cerca de 16.466 requisições/s. Essa comparação descreve a amostra medida, sem estabelecer uma vantagem universal de uma configuração.</w:t>
+        <w:t>No lote de 5.000 inserções, uma thread teve mediana de 0,3365 s e vazão de 14.857 requisições/s. Com quatro threads, a mediana foi 0,2731 s, 18,9% menor, e a vazão foi 18.309 requisições/s. A aceleração observada foi 1,23 vez. As faixas se sobrepõem; a comparação não estabelece uma vantagem universal.</w:t>
       </w:r>
     </w:p>
     <w:p>
@@ -5604,7 +5604,7 @@
         <w:pStyle w:val="Ttulo2"/>
         <w:pageBreakBefore/>
       </w:pPr>
-      <w:bookmarkStart w:id="7" w:name="_Toc240748077"/>
+      <w:bookmarkStart w:id="7" w:name="_Toc240797378"/>
       <w:r>
         <w:lastRenderedPageBreak/>
         <w:t>4.1 Distribuição dos tempos</w:t>
@@ -5697,7 +5697,7 @@
       <w:pPr>
         <w:pStyle w:val="Ttulo2"/>
       </w:pPr>
-      <w:bookmarkStart w:id="8" w:name="_Toc240748078"/>
+      <w:bookmarkStart w:id="8" w:name="_Toc240797379"/>
       <w:r>
         <w:lastRenderedPageBreak/>
         <w:t>4.2 Validação funcional e utilização do pool</w:t>
@@ -5709,7 +5709,7 @@
         <w:jc w:val="both"/>
       </w:pPr>
       <w:r>
-        <w:t>O teste funcional executou INSERT, SELECT, UPDATE e DELETE, além de verificar ID duplicado, registro inexistente, ID negativo, ID com letras, nome ausente e argumentos extras. Na disputa de 12 clientes pelo mesmo ID, uma inserção foi aceita e 11 foram rejeitadas. Também foram verificadas 20 inserções seguidas de PARAR e a falha de conexão após o encerramento do servidor.</w:t>
+        <w:t>O teste funcional verificou CRUD e erros de entrada no cliente e no log, além de uma sequência de operações dependentes. Na disputa de 12 clientes pelo mesmo ID, uma inserção foi aceita e 11 rejeitadas. Também conferiu respostas de 24 clientes com IDs distintos, com até 12 processos simultâneos, 20 inserções seguidas de PARAR e falha de conexão após o encerramento.</w:t>
       </w:r>
     </w:p>
     <w:p>
@@ -5717,14 +5717,14 @@
         <w:jc w:val="both"/>
       </w:pPr>
       <w:r>
-        <w:t>Nos cinco lotes de 5.000 inserções com quatro threads, foram registradas 6.244 operações na thread 1, 6.255 na thread 2, 6.247 na thread 3 e 6.254 na thread 4, totalizando 25.000. As contagens confirmam a participação de todas as threads nessa configuração. Elas não demonstram execução simultânea dentro do banco, pois sua seção crítica é exclusiva.</w:t>
+        <w:t>Nos cinco lotes de 5.000 inserções com quatro threads, as contagens foram T1: 6.260, T2: 6.248, T3: 6.239, T4: 6.253. O total foi 25.000. Todas as threads participaram, mas isso não demonstra execução simultânea dentro do banco, pois sua seção crítica é exclusiva.</w:t>
       </w:r>
     </w:p>
     <w:p>
       <w:pPr>
         <w:pStyle w:val="Ttulo2"/>
       </w:pPr>
-      <w:bookmarkStart w:id="9" w:name="_Toc240748079"/>
+      <w:bookmarkStart w:id="9" w:name="_Toc240797380"/>
       <w:r>
         <w:t>4.3 Discussão e limitações</w:t>
       </w:r>
@@ -5735,7 +5735,7 @@
         <w:jc w:val="both"/>
       </w:pPr>
       <w:r>
-        <w:t>Para 1.000 inserções, duas threads tiveram mediana ligeiramente menor, mas as faixas observadas se sobrepõem. As diferenças não são consistentes nos demais volumes.</w:t>
+        <w:t>As menores medianas ocorreram com uma thread para 100 inserções, duas para 1.000 e quatro para 5.000. Oito threads não melhoraram a mediana frente a uma thread em nenhum volume. Há dispersão e sobreposição entre faixas; não foi realizado teste de significância.</w:t>
       </w:r>
     </w:p>
     <w:p>
@@ -5743,7 +5743,7 @@
         <w:jc w:val="both"/>
       </w:pPr>
       <w:r>
-        <w:t>O aumento do pool não produziu redução consistente do tempo. O acesso ao vetor ocorre sob um único mutex, incluindo a busca sequencial do identificador. Dessa forma, as operações no banco são serializadas. A recepção atende uma conexão de cada vez, e o log possui sincronização e flush por resposta. Acrescentar threads mantém essas etapas e adiciona coordenação. Esses fatores são compatíveis com o resultado, mas o experimento não isolou a contribuição de cada um.</w:t>
+        <w:t>Não houve redução monotônica do tempo ao ampliar o pool. O acesso ao vetor e a busca sequencial do ID ocorrem sob um único mutex. A recepção é sequencial, mas os pedidos mantêm conexões independentes até receber a resposta da thread. O log também tem mutex e flush. Esses custos coexistem com o atendimento concorrente; o experimento não isolou a contribuição de cada etapa.</w:t>
       </w:r>
     </w:p>
     <w:p>
@@ -5759,7 +5759,7 @@
         <w:jc w:val="both"/>
       </w:pPr>
       <w:r>
-        <w:t>A solução também possui limites funcionais deliberados: o banco não é persistente, a fila não tem tamanho máximo e os clientes usam um protocolo simples. O programa não oferece transações compostas nem garante a ordem de conclusão de pedidos dependentes. Essas restrições mantêm o projeto didático e ajudam a delimitar os resultados apresentados.</w:t>
+        <w:t>O banco não é persistente e a fila não tem limite. O protocolo não oferece transações compostas nem ordenação entre clientes distintos. Cada cliente aguarda sua própria resposta. Leituras e escritas IPC não têm timeout; um cliente que deixe de ler pode ocupar uma thread. O projeto pressupõe os clientes locais fornecidos.</w:t>
       </w:r>
     </w:p>
     <w:p>
@@ -5767,7 +5767,7 @@
         <w:pStyle w:val="Ttulo1"/>
         <w:pageBreakBefore/>
       </w:pPr>
-      <w:bookmarkStart w:id="10" w:name="_Toc240748080"/>
+      <w:bookmarkStart w:id="10" w:name="_Toc240797381"/>
       <w:r>
         <w:lastRenderedPageBreak/>
         <w:t>5 CONCLUSÃO</w:t>
@@ -5779,7 +5779,7 @@
         <w:jc w:val="both"/>
       </w:pPr>
       <w:r>
-        <w:t>O sistema implementou comunicação real entre processos, um pool de threads no servidor e proteção das estruturas compartilhadas por mecanismos do Windows. Os testes funcionais e as simulações verificaram as operações nos cenários avaliados, sem perdas ou duplicações nas 122.000 inserções medidas.</w:t>
+        <w:t>O sistema implementou IPC real, um pool de threads e proteção das estruturas compartilhadas no Windows. O servidor mantém o log previsto no enunciado e devolve os resultados ao cliente. Os testes funcionais e as simulações verificaram os cenários avaliados, sem perdas ou duplicações nas 122.000 inserções medidas.</w:t>
       </w:r>
     </w:p>
     <w:p>
@@ -5787,7 +5787,7 @@
         <w:jc w:val="both"/>
       </w:pPr>
       <w:r>
-        <w:t>A avaliação mostrou que concorrência correta não implica aceleração. Para a carga utilizada, ampliar o pool não trouxe ganho consistente. Como continuidade, podem ser avaliados lotes maiores, mais repetições e cargas de consulta e atualização, com preparação dos dados e controle das dependências. A redução das seções críticas e a mudança da estratégia de log exigiriam novas medições antes de qualquer conclusão sobre desempenho.</w:t>
+        <w:t>A concorrência correta não garante aceleração em toda carga. Nesta amostra, quatro threads reduziram a mediana em 18,9% no lote de 5.000 inserções, mas as diferenças variaram com o volume e apresentaram dispersão. Novos estudos podem ampliar lotes e repetições e incluir consultas e atualizações. Alterações no banco ou no log exigem novas medições.</w:t>
       </w:r>
     </w:p>
     <w:p>
@@ -5796,7 +5796,7 @@
         <w:pageBreakBefore/>
         <w:jc w:val="center"/>
       </w:pPr>
-      <w:bookmarkStart w:id="11" w:name="_Toc240748081"/>
+      <w:bookmarkStart w:id="11" w:name="_Toc240797382"/>
       <w:r>
         <w:lastRenderedPageBreak/>
         <w:t>REFERÊNCIAS</w:t>
@@ -5911,7 +5911,7 @@
         <w:pageBreakBefore/>
         <w:jc w:val="center"/>
       </w:pPr>
-      <w:bookmarkStart w:id="12" w:name="_Toc240748082"/>
+      <w:bookmarkStart w:id="12" w:name="_Toc240797383"/>
       <w:r>
         <w:lastRenderedPageBreak/>
         <w:t>APÊNDICE A – INSTRUÇÕES DE EXECUÇÃO</w:t>
@@ -5923,7 +5923,7 @@
         <w:jc w:val="both"/>
       </w:pPr>
       <w:r>
-        <w:t>O projeto contém fontes, dois executáveis Windows, script de compilação, testes, dados brutos e logs. Para compilar, é necessário g++ no PATH. O arquivo compilar.bat gera cliente.exe e servidor.exe. Em dois terminais na pasta do projeto, execute os comandos a seguir.</w:t>
+        <w:t>O pacote inclui fontes, executáveis, testes e resultados. No Git, os executáveis são ignorados e devem ser compilados. Com g++ no PATH, compilar.bat gera cliente.exe e servidor.exe. Execute os comandos abaixo; o cliente mostra as respostas, e o servidor também as grava em servidor.log.</w:t>
       </w:r>
     </w:p>
     <w:p>
@@ -6001,7 +6001,7 @@
         <w:jc w:val="both"/>
       </w:pPr>
       <w:r>
-        <w:t>Os dois últimos comandos devem ser executados depois de encerrar qualquer servidor manual. Cada script inicia o próprio servidor. As medições analisadas estão em resultados/simulacao_20260919_213111. O arquivo dados.json preserva os tempos sem arredondamento, a ordem dos ensaios e hashes SHA-256 dos fontes e executáveis; resumo.json reúne as estatísticas.</w:t>
+        <w:t>Feche o servidor manual antes dos testes: cada script inicia o próprio servidor. A rodada analisada está em resultados/simulacao_20260920_114551. dados.json preserva tempos e hashes; resumo.json reúne estatísticas. METODO.md explica o canal isolado, e fontes_medidos contém a cópia testada. CLS limpa o cliente; SAIR fecha apenas esse processo.</w:t>
       </w:r>
     </w:p>
     <w:p>

</xml_diff>